<commit_message>
agregado video al readme, build recompilado
</commit_message>
<xml_diff>
--- a/Evidences/Evidence2/docs/Evidencia2.docx
+++ b/Evidences/Evidence2/docs/Evidencia2.docx
@@ -48,167 +48,122 @@
         <w:ind/>
         <w:rPr/>
       </w:pPr>
-      <w:r>
-        <w:t xml:space="preserve">Programa principal: </w:t>
-      </w:r>
-      <w:r>
-        <w:rPr>
-          <w:rFonts w:ascii="Courier New" w:hAnsi="Courier New"/>
-          <w:sz w:val="19"/>
-        </w:rPr>
-        <w:t xml:space="preserve">main.cpp</w:t>
-      </w:r>
-      <w:r>
-        <w:t xml:space="preserve">. Pruebas de las estructuras: </w:t>
-      </w:r>
-      <w:r>
-        <w:rPr>
-          <w:rFonts w:ascii="Courier New" w:hAnsi="Courier New"/>
-          <w:sz w:val="19"/>
-        </w:rPr>
-        <w:t xml:space="preserve">pruebas.cpp</w:t>
-      </w:r>
-      <w:r>
-        <w:t xml:space="preserve">. Estructuras: </w:t>
-      </w:r>
-      <w:r>
-        <w:rPr>
-          <w:rFonts w:ascii="Courier New" w:hAnsi="Courier New"/>
-          <w:sz w:val="19"/>
-        </w:rPr>
-        <w:t xml:space="preserve">estructuras.h</w:t>
-      </w:r>
-      <w:r>
-        <w:t xml:space="preserve"> (lista ligada, pila, fila, lista doblemente ligada con Merge Sort) y </w:t>
-      </w:r>
-      <w:r>
-        <w:rPr>
-          <w:rFonts w:ascii="Courier New" w:hAnsi="Courier New"/>
-          <w:sz w:val="19"/>
-        </w:rPr>
-        <w:t xml:space="preserve">registro.h</w:t>
-      </w:r>
-      <w:r>
-        <w:t xml:space="preserve"> (validación de líneas).</w:t>
-      </w:r>
       <w:r/>
-    </w:p>
-    <w:p>
-      <w:pPr>
-        <w:pBdr/>
-        <w:spacing/>
-        <w:ind/>
-        <w:rPr/>
-      </w:pPr>
-      <w:r>
-        <w:t xml:space="preserve">Compilar y correr:</w:t>
-      </w:r>
-      <w:r/>
-    </w:p>
-    <w:tbl>
-      <w:tblPr>
-        <w:tblStyle w:val="934"/>
-        <w:tblW w:w="0" w:type="auto"/>
-        <w:tblBorders/>
-        <w:tblLook w:val="04A0" w:firstRow="1" w:lastRow="0" w:firstColumn="1" w:lastColumn="0" w:noHBand="0" w:noVBand="1"/>
-      </w:tblPr>
-      <w:tblGrid>
-        <w:gridCol w:w="8640"/>
-      </w:tblGrid>
-      <w:tr>
-        <w:trPr/>
-        <w:tc>
-          <w:tcPr>
-            <w:shd w:val="clear" w:color="auto" w:fill="f2f2f2"/>
-            <w:tcBorders/>
-            <w:tcW w:w="8640" w:type="dxa"/>
-          </w:tcPr>
-          <w:p>
-            <w:pPr>
-              <w:pBdr/>
-              <w:spacing w:after="0"/>
-              <w:ind/>
-              <w:rPr/>
-            </w:pPr>
-            <w:r>
-              <w:rPr>
-                <w:rFonts w:ascii="Courier New" w:hAnsi="Courier New"/>
-                <w:sz w:val="17"/>
-              </w:rPr>
-              <w:t xml:space="preserve">g++ -std=c++17 main.cpp -o main &amp;&amp; ./main</w:t>
-            </w:r>
-            <w:r/>
-          </w:p>
-          <w:p>
-            <w:pPr>
-              <w:pBdr/>
-              <w:spacing w:after="0"/>
-              <w:ind/>
-              <w:rPr/>
-            </w:pPr>
-            <w:r>
-              <w:rPr>
-                <w:rFonts w:ascii="Courier New" w:hAnsi="Courier New"/>
-                <w:sz w:val="17"/>
-              </w:rPr>
-              <w:t xml:space="preserve">g++ -std=c++17 pruebas.cpp -o pruebas &amp;&amp; ./pruebas</w:t>
-            </w:r>
-            <w:r/>
-          </w:p>
-        </w:tc>
-      </w:tr>
-    </w:tbl>
-    <w:p>
-      <w:pPr>
-        <w:pBdr/>
-        <w:spacing/>
-        <w:ind/>
-        <w:rPr/>
-      </w:pPr>
       <w:r/>
       <w:r/>
     </w:p>
     <w:p>
       <w:pPr>
-        <w:pStyle w:val="875"/>
-        <w:pBdr/>
-        <w:spacing/>
-        <w:ind/>
-        <w:rPr/>
+        <w:pBdr/>
+        <w:spacing/>
+        <w:ind/>
+        <w:rPr>
+          <w:b/>
+          <w:bCs/>
+          <w:highlight w:val="none"/>
+        </w:rPr>
       </w:pPr>
       <w:r>
-        <w:t xml:space="preserve">1. Evidencia de ejecución</w:t>
+        <w:rPr>
+          <w:b/>
+          <w:bCs/>
+          <w:highlight w:val="none"/>
+        </w:rPr>
+        <w:t xml:space="preserve">Parte A </w:t>
       </w:r>
-      <w:r/>
+      <w:r>
+        <w:rPr>
+          <w:b/>
+          <w:bCs/>
+        </w:rPr>
+      </w:r>
     </w:p>
     <w:p>
       <w:pPr>
-        <w:pStyle w:val="876"/>
-        <w:pBdr/>
-        <w:spacing/>
-        <w:ind/>
-        <w:rPr/>
+        <w:pBdr/>
+        <w:spacing/>
+        <w:ind/>
+        <w:rPr>
+          <w:b/>
+          <w:bCs/>
+        </w:rPr>
       </w:pPr>
       <w:r>
-        <w:t xml:space="preserve">1.1 Capturas de pantalla</w:t>
+        <w:rPr>
+          <w:b/>
+          <w:bCs/>
+        </w:rPr>
       </w:r>
-      <w:r/>
+      <w:r>
+        <w:rPr>
+          <w:b/>
+          <w:bCs/>
+        </w:rPr>
+      </w:r>
+      <w:r>
+        <w:rPr>
+          <w:b/>
+          <w:bCs/>
+        </w:rPr>
+      </w:r>
     </w:p>
     <w:p>
       <w:pPr>
         <w:pBdr/>
         <w:spacing/>
         <w:ind/>
-        <w:rPr/>
-      </w:pPr>
+        <w:rPr>
+          <w:b w:val="0"/>
+          <w:bCs w:val="0"/>
+          <w:highlight w:val="none"/>
+        </w:rPr>
+      </w:pPr>
+      <w:r>
+        <w:rPr>
+          <w:b w:val="0"/>
+          <w:bCs w:val="0"/>
+          <w:highlight w:val="none"/>
+        </w:rPr>
+        <w:t xml:space="preserve">Programa de pruebas: </w:t>
+      </w:r>
+      <w:r>
+        <w:rPr>
+          <w:b w:val="0"/>
+          <w:bCs w:val="0"/>
+        </w:rPr>
+      </w:r>
+    </w:p>
+    <w:p>
+      <w:pPr>
+        <w:pBdr/>
+        <w:spacing/>
+        <w:ind/>
+        <w:rPr>
+          <w:b w:val="0"/>
+          <w:bCs w:val="0"/>
+          <w:highlight w:val="none"/>
+        </w:rPr>
+      </w:pPr>
+      <w:r>
+        <w:rPr>
+          <w:b w:val="0"/>
+          <w:bCs w:val="0"/>
+        </w:rPr>
+      </w:r>
+      <w:r>
+        <w:rPr>
+          <w:b w:val="0"/>
+          <w:bCs w:val="0"/>
+        </w:rPr>
+      </w:r>
       <w:r>
         <mc:AlternateContent>
           <mc:Choice Requires="wpg">
             <w:drawing>
               <wp:inline xmlns:wp="http://schemas.openxmlformats.org/drawingml/2006/wordprocessingDrawing" distT="0" distB="0" distL="0" distR="0">
-                <wp:extent cx="5486400" cy="2751488"/>
+                <wp:extent cx="5486400" cy="4990798"/>
                 <wp:effectExtent l="0" t="0" r="0" b="0"/>
-                <wp:docPr id="1" name="Picture 1"/>
+                <wp:docPr id="1" name=""/>
                 <wp:cNvGraphicFramePr>
                   <a:graphicFrameLocks xmlns:a="http://schemas.openxmlformats.org/drawingml/2006/main" noChangeAspect="1"/>
                 </wp:cNvGraphicFramePr>
@@ -216,7 +171,7 @@
                   <a:graphicData uri="http://schemas.openxmlformats.org/drawingml/2006/picture">
                     <pic:pic xmlns:pic="http://schemas.openxmlformats.org/drawingml/2006/picture">
                       <pic:nvPicPr>
-                        <pic:cNvPr id="0" name="Screenshot from 2026-10-18 10-40-08.png"/>
+                        <pic:cNvPr id="2029096162" name=""/>
                         <pic:cNvPicPr>
                           <a:picLocks noChangeAspect="1"/>
                         </pic:cNvPicPr>
@@ -229,7 +184,7 @@
                       <pic:spPr bwMode="auto">
                         <a:xfrm>
                           <a:off x="0" y="0"/>
-                          <a:ext cx="5486400" cy="2751488"/>
+                          <a:ext cx="5486399" cy="4990798"/>
                         </a:xfrm>
                         <a:prstGeom prst="rect">
                           <a:avLst/>
@@ -262,7 +217,7 @@
                 <v:path o:extrusionok="f" gradientshapeok="t" o:connecttype="rect"/>
                 <o:lock v:ext="edit" aspectratio="t"/>
               </v:shapetype>
-              <v:shape id="_x0000_i0" o:spid="_x0000_s0" type="#_x0000_t75" style="width:432.00pt;height:216.65pt;mso-wrap-distance-left:0.00pt;mso-wrap-distance-top:0.00pt;mso-wrap-distance-right:0.00pt;mso-wrap-distance-bottom:0.00pt;z-index:1;" stroked="false">
+              <v:shape id="_x0000_i0" o:spid="_x0000_s0" type="#_x0000_t75" style="width:432.00pt;height:392.98pt;mso-wrap-distance-left:0.00pt;mso-wrap-distance-top:0.00pt;mso-wrap-distance-right:0.00pt;mso-wrap-distance-bottom:0.00pt;z-index:1;" stroked="false">
                 <v:imagedata r:id="rId10" o:title=""/>
                 <o:lock v:ext="edit" rotation="t"/>
               </v:shape>
@@ -270,6 +225,88 @@
           </mc:Fallback>
         </mc:AlternateContent>
       </w:r>
+      <w:r>
+        <w:rPr>
+          <w:b w:val="0"/>
+          <w:bCs w:val="0"/>
+        </w:rPr>
+      </w:r>
+      <w:r>
+        <w:rPr>
+          <w:b w:val="0"/>
+          <w:bCs w:val="0"/>
+        </w:rPr>
+      </w:r>
+    </w:p>
+    <w:p>
+      <w:pPr>
+        <w:pBdr/>
+        <w:spacing/>
+        <w:ind/>
+        <w:rPr>
+          <w:b w:val="0"/>
+          <w:bCs w:val="0"/>
+        </w:rPr>
+      </w:pPr>
+      <w:r>
+        <w:rPr>
+          <w:b w:val="0"/>
+          <w:bCs w:val="0"/>
+        </w:rPr>
+      </w:r>
+      <w:r>
+        <w:rPr>
+          <w:b w:val="0"/>
+          <w:bCs w:val="0"/>
+        </w:rPr>
+      </w:r>
+      <w:r>
+        <w:rPr>
+          <w:b w:val="0"/>
+          <w:bCs w:val="0"/>
+        </w:rPr>
+      </w:r>
+    </w:p>
+    <w:p>
+      <w:pPr>
+        <w:pBdr/>
+        <w:spacing/>
+        <w:ind/>
+        <w:rPr>
+          <w:b/>
+          <w:bCs/>
+        </w:rPr>
+      </w:pPr>
+      <w:r>
+        <w:rPr>
+          <w:b/>
+          <w:bCs/>
+          <w:highlight w:val="none"/>
+        </w:rPr>
+        <w:t xml:space="preserve">Parte B </w:t>
+      </w:r>
+      <w:r>
+        <w:rPr>
+          <w:b w:val="0"/>
+          <w:bCs w:val="0"/>
+          <w:highlight w:val="none"/>
+        </w:rPr>
+      </w:r>
+      <w:r>
+        <w:rPr>
+          <w:b/>
+          <w:bCs/>
+        </w:rPr>
+      </w:r>
+    </w:p>
+    <w:p>
+      <w:pPr>
+        <w:pBdr/>
+        <w:spacing/>
+        <w:ind/>
+        <w:rPr/>
+      </w:pPr>
+      <w:r/>
       <w:r/>
     </w:p>
     <w:p>
@@ -279,12 +316,32 @@
         <w:ind/>
         <w:rPr/>
       </w:pPr>
+      <w:r/>
+      <w:r/>
+    </w:p>
+    <w:p>
+      <w:pPr>
+        <w:pStyle w:val="875"/>
+        <w:pBdr/>
+        <w:spacing/>
+        <w:ind/>
+        <w:rPr/>
+      </w:pPr>
       <w:r>
-        <w:rPr>
-          <w:i/>
-          <w:sz w:val="18"/>
-        </w:rPr>
-        <w:t xml:space="preserve">Carga del archivo, y opciones 3 y 2 antes de ordenar (avisa que primero hay que ordenar)</w:t>
+        <w:t xml:space="preserve">1. Evidencia de ejecución</w:t>
+      </w:r>
+      <w:r/>
+    </w:p>
+    <w:p>
+      <w:pPr>
+        <w:pStyle w:val="876"/>
+        <w:pBdr/>
+        <w:spacing/>
+        <w:ind/>
+        <w:rPr/>
+      </w:pPr>
+      <w:r>
+        <w:t xml:space="preserve">1.1 Capturas de pantalla</w:t>
       </w:r>
       <w:r/>
     </w:p>
@@ -302,7 +359,7 @@
               <wp:inline xmlns:wp="http://schemas.openxmlformats.org/drawingml/2006/wordprocessingDrawing" distT="0" distB="0" distL="0" distR="0">
                 <wp:extent cx="5486400" cy="2751488"/>
                 <wp:effectExtent l="0" t="0" r="0" b="0"/>
-                <wp:docPr id="2" name="Picture 2"/>
+                <wp:docPr id="2" name="Picture 1"/>
                 <wp:cNvGraphicFramePr>
                   <a:graphicFrameLocks xmlns:a="http://schemas.openxmlformats.org/drawingml/2006/main" noChangeAspect="1"/>
                 </wp:cNvGraphicFramePr>
@@ -310,7 +367,7 @@
                   <a:graphicData uri="http://schemas.openxmlformats.org/drawingml/2006/picture">
                     <pic:pic xmlns:pic="http://schemas.openxmlformats.org/drawingml/2006/picture">
                       <pic:nvPicPr>
-                        <pic:cNvPr id="0" name="Screenshot from 2026-10-18 10-40-41.png"/>
+                        <pic:cNvPr id="0" name="Screenshot from 2026-10-18 10-40-08.png"/>
                         <pic:cNvPicPr>
                           <a:picLocks noChangeAspect="1"/>
                         </pic:cNvPicPr>
@@ -378,6 +435,100 @@
           <w:i/>
           <w:sz w:val="18"/>
         </w:rPr>
+        <w:t xml:space="preserve">Carga del archivo, y opciones 3 y 2 antes de ordenar (avisa que primero hay que ordenar)</w:t>
+      </w:r>
+      <w:r/>
+    </w:p>
+    <w:p>
+      <w:pPr>
+        <w:pBdr/>
+        <w:spacing/>
+        <w:ind/>
+        <w:rPr/>
+      </w:pPr>
+      <w:r>
+        <mc:AlternateContent>
+          <mc:Choice Requires="wpg">
+            <w:drawing>
+              <wp:inline xmlns:wp="http://schemas.openxmlformats.org/drawingml/2006/wordprocessingDrawing" distT="0" distB="0" distL="0" distR="0">
+                <wp:extent cx="5486400" cy="2751488"/>
+                <wp:effectExtent l="0" t="0" r="0" b="0"/>
+                <wp:docPr id="3" name="Picture 2"/>
+                <wp:cNvGraphicFramePr>
+                  <a:graphicFrameLocks xmlns:a="http://schemas.openxmlformats.org/drawingml/2006/main" noChangeAspect="1"/>
+                </wp:cNvGraphicFramePr>
+                <a:graphic xmlns:a="http://schemas.openxmlformats.org/drawingml/2006/main">
+                  <a:graphicData uri="http://schemas.openxmlformats.org/drawingml/2006/picture">
+                    <pic:pic xmlns:pic="http://schemas.openxmlformats.org/drawingml/2006/picture">
+                      <pic:nvPicPr>
+                        <pic:cNvPr id="0" name="Screenshot from 2026-10-18 10-40-41.png"/>
+                        <pic:cNvPicPr>
+                          <a:picLocks noChangeAspect="1"/>
+                        </pic:cNvPicPr>
+                        <pic:nvPr/>
+                      </pic:nvPicPr>
+                      <pic:blipFill rotWithShape="1">
+                        <a:blip r:embed="rId12"/>
+                        <a:stretch/>
+                      </pic:blipFill>
+                      <pic:spPr bwMode="auto">
+                        <a:xfrm>
+                          <a:off x="0" y="0"/>
+                          <a:ext cx="5486400" cy="2751488"/>
+                        </a:xfrm>
+                        <a:prstGeom prst="rect">
+                          <a:avLst/>
+                        </a:prstGeom>
+                      </pic:spPr>
+                    </pic:pic>
+                  </a:graphicData>
+                </a:graphic>
+              </wp:inline>
+            </w:drawing>
+          </mc:Choice>
+          <mc:Fallback>
+            <w:pict>
+              <v:shapetype id="_x0000_t75" coordsize="21600,21600" o:spt="75" o:preferrelative="t" path="m@4@5l@4@11@9@11@9@5xe" filled="f" stroked="f">
+                <v:stroke joinstyle="miter"/>
+                <v:formulas>
+                  <v:f eqn="if lineDrawn pixelLineWidth 0"/>
+                  <v:f eqn="sum @0 1 0"/>
+                  <v:f eqn="sum 0 0 @1"/>
+                  <v:f eqn="prod @2 1 2"/>
+                  <v:f eqn="prod @3 21600 pixelWidth"/>
+                  <v:f eqn="prod @3 21600 pixelHeight"/>
+                  <v:f eqn="sum @0 0 1"/>
+                  <v:f eqn="prod @6 1 2"/>
+                  <v:f eqn="prod @7 21600 pixelWidth"/>
+                  <v:f eqn="sum @8 21600 0"/>
+                  <v:f eqn="prod @7 21600 pixelHeight"/>
+                  <v:f eqn="sum @10 21600 0"/>
+                </v:formulas>
+                <v:path o:extrusionok="f" gradientshapeok="t" o:connecttype="rect"/>
+                <o:lock v:ext="edit" aspectratio="t"/>
+              </v:shapetype>
+              <v:shape id="_x0000_i2" o:spid="_x0000_s2" type="#_x0000_t75" style="width:432.00pt;height:216.65pt;mso-wrap-distance-left:0.00pt;mso-wrap-distance-top:0.00pt;mso-wrap-distance-right:0.00pt;mso-wrap-distance-bottom:0.00pt;z-index:1;" stroked="false">
+                <v:imagedata r:id="rId12" o:title=""/>
+                <o:lock v:ext="edit" rotation="t"/>
+              </v:shape>
+            </w:pict>
+          </mc:Fallback>
+        </mc:AlternateContent>
+      </w:r>
+      <w:r/>
+    </w:p>
+    <w:p>
+      <w:pPr>
+        <w:pBdr/>
+        <w:spacing/>
+        <w:ind/>
+        <w:rPr/>
+      </w:pPr>
+      <w:r>
+        <w:rPr>
+          <w:i/>
+          <w:sz w:val="18"/>
+        </w:rPr>
         <w:t xml:space="preserve">Opcion 1: ordenar, con la prediccion y el reporte</w:t>
       </w:r>
       <w:r/>
@@ -396,7 +547,7 @@
               <wp:inline xmlns:wp="http://schemas.openxmlformats.org/drawingml/2006/wordprocessingDrawing" distT="0" distB="0" distL="0" distR="0">
                 <wp:extent cx="5486400" cy="1073098"/>
                 <wp:effectExtent l="0" t="0" r="0" b="0"/>
-                <wp:docPr id="3" name="Picture 3"/>
+                <wp:docPr id="4" name="Picture 3"/>
                 <wp:cNvGraphicFramePr>
                   <a:graphicFrameLocks xmlns:a="http://schemas.openxmlformats.org/drawingml/2006/main" noChangeAspect="1"/>
                 </wp:cNvGraphicFramePr>
@@ -411,7 +562,7 @@
                         <pic:nvPr/>
                       </pic:nvPicPr>
                       <pic:blipFill rotWithShape="1">
-                        <a:blip r:embed="rId12"/>
+                        <a:blip r:embed="rId13"/>
                         <a:stretch/>
                       </pic:blipFill>
                       <pic:spPr bwMode="auto">
@@ -450,8 +601,8 @@
                 <v:path o:extrusionok="f" gradientshapeok="t" o:connecttype="rect"/>
                 <o:lock v:ext="edit" aspectratio="t"/>
               </v:shapetype>
-              <v:shape id="_x0000_i2" o:spid="_x0000_s2" type="#_x0000_t75" style="width:432.00pt;height:84.50pt;mso-wrap-distance-left:0.00pt;mso-wrap-distance-top:0.00pt;mso-wrap-distance-right:0.00pt;mso-wrap-distance-bottom:0.00pt;z-index:1;" stroked="false">
-                <v:imagedata r:id="rId12" o:title=""/>
+              <v:shape id="_x0000_i3" o:spid="_x0000_s3" type="#_x0000_t75" style="width:432.00pt;height:84.50pt;mso-wrap-distance-left:0.00pt;mso-wrap-distance-top:0.00pt;mso-wrap-distance-right:0.00pt;mso-wrap-distance-bottom:0.00pt;z-index:1;" stroked="false">
+                <v:imagedata r:id="rId13" o:title=""/>
                 <o:lock v:ext="edit" rotation="t"/>
               </v:shape>
             </w:pict>
@@ -490,7 +641,7 @@
               <wp:inline xmlns:wp="http://schemas.openxmlformats.org/drawingml/2006/wordprocessingDrawing" distT="0" distB="0" distL="0" distR="0">
                 <wp:extent cx="5486400" cy="3089610"/>
                 <wp:effectExtent l="0" t="0" r="0" b="0"/>
-                <wp:docPr id="4" name="Picture 4"/>
+                <wp:docPr id="5" name="Picture 4"/>
                 <wp:cNvGraphicFramePr>
                   <a:graphicFrameLocks xmlns:a="http://schemas.openxmlformats.org/drawingml/2006/main" noChangeAspect="1"/>
                 </wp:cNvGraphicFramePr>
@@ -505,7 +656,7 @@
                         <pic:nvPr/>
                       </pic:nvPicPr>
                       <pic:blipFill rotWithShape="1">
-                        <a:blip r:embed="rId13"/>
+                        <a:blip r:embed="rId14"/>
                         <a:stretch/>
                       </pic:blipFill>
                       <pic:spPr bwMode="auto">
@@ -544,8 +695,8 @@
                 <v:path o:extrusionok="f" gradientshapeok="t" o:connecttype="rect"/>
                 <o:lock v:ext="edit" aspectratio="t"/>
               </v:shapetype>
-              <v:shape id="_x0000_i3" o:spid="_x0000_s3" type="#_x0000_t75" style="width:432.00pt;height:243.28pt;mso-wrap-distance-left:0.00pt;mso-wrap-distance-top:0.00pt;mso-wrap-distance-right:0.00pt;mso-wrap-distance-bottom:0.00pt;z-index:1;" stroked="false">
-                <v:imagedata r:id="rId13" o:title=""/>
+              <v:shape id="_x0000_i4" o:spid="_x0000_s4" type="#_x0000_t75" style="width:432.00pt;height:243.28pt;mso-wrap-distance-left:0.00pt;mso-wrap-distance-top:0.00pt;mso-wrap-distance-right:0.00pt;mso-wrap-distance-bottom:0.00pt;z-index:1;" stroked="false">
+                <v:imagedata r:id="rId14" o:title=""/>
                 <o:lock v:ext="edit" rotation="t"/>
               </v:shape>
             </w:pict>
@@ -584,7 +735,7 @@
               <wp:inline xmlns:wp="http://schemas.openxmlformats.org/drawingml/2006/wordprocessingDrawing" distT="0" distB="0" distL="0" distR="0">
                 <wp:extent cx="4105274" cy="1600200"/>
                 <wp:effectExtent l="0" t="0" r="0" b="0"/>
-                <wp:docPr id="5" name="Picture 5"/>
+                <wp:docPr id="6" name="Picture 5"/>
                 <wp:cNvGraphicFramePr>
                   <a:graphicFrameLocks xmlns:a="http://schemas.openxmlformats.org/drawingml/2006/main" noChangeAspect="1"/>
                 </wp:cNvGraphicFramePr>
@@ -599,7 +750,7 @@
                         <pic:nvPr/>
                       </pic:nvPicPr>
                       <pic:blipFill rotWithShape="1">
-                        <a:blip r:embed="rId14"/>
+                        <a:blip r:embed="rId15"/>
                         <a:stretch/>
                       </pic:blipFill>
                       <pic:spPr bwMode="auto">
@@ -638,8 +789,8 @@
                 <v:path o:extrusionok="f" gradientshapeok="t" o:connecttype="rect"/>
                 <o:lock v:ext="edit" aspectratio="t"/>
               </v:shapetype>
-              <v:shape id="_x0000_i4" o:spid="_x0000_s4" type="#_x0000_t75" style="width:323.25pt;height:126.00pt;mso-wrap-distance-left:0.00pt;mso-wrap-distance-top:0.00pt;mso-wrap-distance-right:0.00pt;mso-wrap-distance-bottom:0.00pt;z-index:1;" stroked="false">
-                <v:imagedata r:id="rId14" o:title=""/>
+              <v:shape id="_x0000_i5" o:spid="_x0000_s5" type="#_x0000_t75" style="width:323.25pt;height:126.00pt;mso-wrap-distance-left:0.00pt;mso-wrap-distance-top:0.00pt;mso-wrap-distance-right:0.00pt;mso-wrap-distance-bottom:0.00pt;z-index:1;" stroked="false">
+                <v:imagedata r:id="rId15" o:title=""/>
                 <o:lock v:ext="edit" rotation="t"/>
               </v:shape>
             </w:pict>
@@ -678,7 +829,7 @@
               <wp:inline xmlns:wp="http://schemas.openxmlformats.org/drawingml/2006/wordprocessingDrawing" distT="0" distB="0" distL="0" distR="0">
                 <wp:extent cx="5400675" cy="2200275"/>
                 <wp:effectExtent l="0" t="0" r="0" b="0"/>
-                <wp:docPr id="6" name="Picture 6"/>
+                <wp:docPr id="7" name="Picture 6"/>
                 <wp:cNvGraphicFramePr>
                   <a:graphicFrameLocks xmlns:a="http://schemas.openxmlformats.org/drawingml/2006/main" noChangeAspect="1"/>
                 </wp:cNvGraphicFramePr>
@@ -693,7 +844,7 @@
                         <pic:nvPr/>
                       </pic:nvPicPr>
                       <pic:blipFill rotWithShape="1">
-                        <a:blip r:embed="rId15"/>
+                        <a:blip r:embed="rId16"/>
                         <a:stretch/>
                       </pic:blipFill>
                       <pic:spPr bwMode="auto">
@@ -732,8 +883,8 @@
                 <v:path o:extrusionok="f" gradientshapeok="t" o:connecttype="rect"/>
                 <o:lock v:ext="edit" aspectratio="t"/>
               </v:shapetype>
-              <v:shape id="_x0000_i5" o:spid="_x0000_s5" type="#_x0000_t75" style="width:425.25pt;height:173.25pt;mso-wrap-distance-left:0.00pt;mso-wrap-distance-top:0.00pt;mso-wrap-distance-right:0.00pt;mso-wrap-distance-bottom:0.00pt;z-index:1;" stroked="false">
-                <v:imagedata r:id="rId15" o:title=""/>
+              <v:shape id="_x0000_i6" o:spid="_x0000_s6" type="#_x0000_t75" style="width:425.25pt;height:173.25pt;mso-wrap-distance-left:0.00pt;mso-wrap-distance-top:0.00pt;mso-wrap-distance-right:0.00pt;mso-wrap-distance-bottom:0.00pt;z-index:1;" stroked="false">
+                <v:imagedata r:id="rId16" o:title=""/>
                 <o:lock v:ext="edit" rotation="t"/>
               </v:shape>
             </w:pict>
@@ -772,7 +923,7 @@
               <wp:inline xmlns:wp="http://schemas.openxmlformats.org/drawingml/2006/wordprocessingDrawing" distT="0" distB="0" distL="0" distR="0">
                 <wp:extent cx="4162424" cy="3333749"/>
                 <wp:effectExtent l="0" t="0" r="0" b="0"/>
-                <wp:docPr id="7" name="Picture 7"/>
+                <wp:docPr id="8" name="Picture 7"/>
                 <wp:cNvGraphicFramePr>
                   <a:graphicFrameLocks xmlns:a="http://schemas.openxmlformats.org/drawingml/2006/main" noChangeAspect="1"/>
                 </wp:cNvGraphicFramePr>
@@ -787,7 +938,7 @@
                         <pic:nvPr/>
                       </pic:nvPicPr>
                       <pic:blipFill rotWithShape="1">
-                        <a:blip r:embed="rId16"/>
+                        <a:blip r:embed="rId17"/>
                         <a:stretch/>
                       </pic:blipFill>
                       <pic:spPr bwMode="auto">
@@ -826,8 +977,8 @@
                 <v:path o:extrusionok="f" gradientshapeok="t" o:connecttype="rect"/>
                 <o:lock v:ext="edit" aspectratio="t"/>
               </v:shapetype>
-              <v:shape id="_x0000_i6" o:spid="_x0000_s6" type="#_x0000_t75" style="width:327.75pt;height:262.50pt;mso-wrap-distance-left:0.00pt;mso-wrap-distance-top:0.00pt;mso-wrap-distance-right:0.00pt;mso-wrap-distance-bottom:0.00pt;z-index:1;" stroked="false">
-                <v:imagedata r:id="rId16" o:title=""/>
+              <v:shape id="_x0000_i7" o:spid="_x0000_s7" type="#_x0000_t75" style="width:327.75pt;height:262.50pt;mso-wrap-distance-left:0.00pt;mso-wrap-distance-top:0.00pt;mso-wrap-distance-right:0.00pt;mso-wrap-distance-bottom:0.00pt;z-index:1;" stroked="false">
+                <v:imagedata r:id="rId17" o:title=""/>
                 <o:lock v:ext="edit" rotation="t"/>
               </v:shape>
             </w:pict>
@@ -866,7 +1017,7 @@
               <wp:inline xmlns:wp="http://schemas.openxmlformats.org/drawingml/2006/wordprocessingDrawing" distT="0" distB="0" distL="0" distR="0">
                 <wp:extent cx="4371975" cy="3629025"/>
                 <wp:effectExtent l="0" t="0" r="0" b="0"/>
-                <wp:docPr id="8" name="Picture 8"/>
+                <wp:docPr id="9" name="Picture 8"/>
                 <wp:cNvGraphicFramePr>
                   <a:graphicFrameLocks xmlns:a="http://schemas.openxmlformats.org/drawingml/2006/main" noChangeAspect="1"/>
                 </wp:cNvGraphicFramePr>
@@ -881,7 +1032,7 @@
                         <pic:nvPr/>
                       </pic:nvPicPr>
                       <pic:blipFill rotWithShape="1">
-                        <a:blip r:embed="rId17"/>
+                        <a:blip r:embed="rId18"/>
                         <a:stretch/>
                       </pic:blipFill>
                       <pic:spPr bwMode="auto">
@@ -920,8 +1071,8 @@
                 <v:path o:extrusionok="f" gradientshapeok="t" o:connecttype="rect"/>
                 <o:lock v:ext="edit" aspectratio="t"/>
               </v:shapetype>
-              <v:shape id="_x0000_i7" o:spid="_x0000_s7" type="#_x0000_t75" style="width:344.25pt;height:285.75pt;mso-wrap-distance-left:0.00pt;mso-wrap-distance-top:0.00pt;mso-wrap-distance-right:0.00pt;mso-wrap-distance-bottom:0.00pt;z-index:1;" stroked="false">
-                <v:imagedata r:id="rId17" o:title=""/>
+              <v:shape id="_x0000_i8" o:spid="_x0000_s8" type="#_x0000_t75" style="width:344.25pt;height:285.75pt;mso-wrap-distance-left:0.00pt;mso-wrap-distance-top:0.00pt;mso-wrap-distance-right:0.00pt;mso-wrap-distance-bottom:0.00pt;z-index:1;" stroked="false">
+                <v:imagedata r:id="rId18" o:title=""/>
                 <o:lock v:ext="edit" rotation="t"/>
               </v:shape>
             </w:pict>
@@ -960,7 +1111,7 @@
               <wp:inline xmlns:wp="http://schemas.openxmlformats.org/drawingml/2006/wordprocessingDrawing" distT="0" distB="0" distL="0" distR="0">
                 <wp:extent cx="3590925" cy="1333500"/>
                 <wp:effectExtent l="0" t="0" r="0" b="0"/>
-                <wp:docPr id="9" name="Picture 9"/>
+                <wp:docPr id="10" name="Picture 9"/>
                 <wp:cNvGraphicFramePr>
                   <a:graphicFrameLocks xmlns:a="http://schemas.openxmlformats.org/drawingml/2006/main" noChangeAspect="1"/>
                 </wp:cNvGraphicFramePr>
@@ -975,7 +1126,7 @@
                         <pic:nvPr/>
                       </pic:nvPicPr>
                       <pic:blipFill rotWithShape="1">
-                        <a:blip r:embed="rId18"/>
+                        <a:blip r:embed="rId19"/>
                         <a:stretch/>
                       </pic:blipFill>
                       <pic:spPr bwMode="auto">
@@ -1014,8 +1165,8 @@
                 <v:path o:extrusionok="f" gradientshapeok="t" o:connecttype="rect"/>
                 <o:lock v:ext="edit" aspectratio="t"/>
               </v:shapetype>
-              <v:shape id="_x0000_i8" o:spid="_x0000_s8" type="#_x0000_t75" style="width:282.75pt;height:105.00pt;mso-wrap-distance-left:0.00pt;mso-wrap-distance-top:0.00pt;mso-wrap-distance-right:0.00pt;mso-wrap-distance-bottom:0.00pt;z-index:1;" stroked="false">
-                <v:imagedata r:id="rId18" o:title=""/>
+              <v:shape id="_x0000_i9" o:spid="_x0000_s9" type="#_x0000_t75" style="width:282.75pt;height:105.00pt;mso-wrap-distance-left:0.00pt;mso-wrap-distance-top:0.00pt;mso-wrap-distance-right:0.00pt;mso-wrap-distance-bottom:0.00pt;z-index:1;" stroked="false">
+                <v:imagedata r:id="rId19" o:title=""/>
                 <o:lock v:ext="edit" rotation="t"/>
               </v:shape>
             </w:pict>
@@ -3892,6 +4043,11 @@
           <w:highlight w:val="none"/>
         </w:rPr>
       </w:r>
+      <w:r>
+        <w:rPr>
+          <w:highlight w:val="none"/>
+        </w:rPr>
+      </w:r>
     </w:p>
     <w:p>
       <w:pPr>
@@ -3966,6 +4122,12 @@
           <w:lang w:val="es-ES"/>
         </w:rPr>
         <w:t xml:space="preserve">é la lista ligada como base de la pila y la fila, porque con un puntero al inicio y otro al final puedo agregar y quitar en los extremos sin recorrer nada. Eso es lo que se necesita en ambos casos. </w:t>
+      </w:r>
+      <w:r>
+        <w:rPr>
+          <w:highlight w:val="none"/>
+          <w:lang w:val="es-ES"/>
+        </w:rPr>
       </w:r>
       <w:r>
         <w:rPr>
@@ -4067,6 +4229,12 @@
           <w:lang w:val="es-ES"/>
         </w:rPr>
       </w:r>
+      <w:r>
+        <w:rPr>
+          <w:highlight w:val="none"/>
+          <w:lang w:val="es-ES"/>
+        </w:rPr>
+      </w:r>
     </w:p>
     <w:p>
       <w:pPr>
@@ -4133,6 +4301,12 @@
           <w:lang w:val="es-ES"/>
         </w:rPr>
         <w:t xml:space="preserve">és. </w:t>
+      </w:r>
+      <w:r>
+        <w:rPr>
+          <w:highlight w:val="none"/>
+          <w:lang w:val="es-ES"/>
+        </w:rPr>
       </w:r>
       <w:r>
         <w:rPr>
@@ -4406,6 +4580,7 @@
           <w:b/>
           <w:bCs/>
           <w:highlight w:val="none"/>
+          <w:lang w:val="es-ES" w:bidi="es-ES"/>
         </w:rPr>
       </w:r>
       <w:r>
@@ -4548,35 +4723,7 @@
           <w:b w:val="0"/>
           <w:bCs w:val="0"/>
           <w:highlight w:val="none"/>
-        </w:rPr>
-      </w:r>
-      <w:r>
-        <w:rPr>
-          <w:b w:val="0"/>
-          <w:bCs w:val="0"/>
-          <w:highlight w:val="none"/>
           <w:lang w:val="es-ES" w:bidi="es-ES"/>
-        </w:rPr>
-      </w:r>
-      <w:r>
-        <w:rPr>
-          <w:b w:val="0"/>
-          <w:bCs w:val="0"/>
-          <w:highlight w:val="none"/>
-        </w:rPr>
-      </w:r>
-      <w:r>
-        <w:rPr>
-          <w:b w:val="0"/>
-          <w:bCs w:val="0"/>
-          <w:highlight w:val="none"/>
-        </w:rPr>
-      </w:r>
-      <w:r>
-        <w:rPr>
-          <w:b w:val="0"/>
-          <w:bCs w:val="0"/>
-          <w:highlight w:val="none"/>
         </w:rPr>
       </w:r>
       <w:r>
@@ -4659,6 +4806,7 @@
           <w:b w:val="0"/>
           <w:bCs w:val="0"/>
           <w:highlight w:val="none"/>
+          <w:lang w:val="es-ES" w:bidi="es-ES"/>
         </w:rPr>
       </w:r>
       <w:r>
@@ -4776,7 +4924,6 @@
           <w:b w:val="0"/>
           <w:bCs w:val="0"/>
           <w:highlight w:val="none"/>
-          <w:lang w:val="es-ES" w:bidi="es-ES"/>
         </w:rPr>
       </w:r>
       <w:r>

</xml_diff>

<commit_message>
actualizado nombres de archivos log607 y output607 en el documento de evidencia
</commit_message>
<xml_diff>
--- a/Evidences/Evidence2/docs/Evidencia2.docx
+++ b/Evidences/Evidence2/docs/Evidencia2.docx
@@ -1206,7 +1206,7 @@
           <w:rFonts w:ascii="Courier New" w:hAnsi="Courier New"/>
           <w:sz w:val="19"/>
         </w:rPr>
-        <w:t xml:space="preserve">output608.out</w:t>
+        <w:t>output607.out</w:t>
       </w:r>
       <w:r>
         <w:t xml:space="preserve"> (primeras líneas, archivo </w:t>
@@ -2428,7 +2428,7 @@
                 <w:rFonts w:ascii="Courier New" w:hAnsi="Courier New"/>
                 <w:sz w:val="17"/>
               </w:rPr>
-              <w:t xml:space="preserve">Archivo a cargar (log608-1.txt / log608-2.txt): No se pudo abrir 'noexiste.txt'. Intenta de nuevo.</w:t>
+              <w:t>Archivo a cargar (log607-1.txt / log607-2.txt): No se pudo abrir 'noexiste.txt'. Intenta de nuevo.</w:t>
             </w:r>
             <w:r/>
           </w:p>
@@ -2444,7 +2444,7 @@
                 <w:rFonts w:ascii="Courier New" w:hAnsi="Courier New"/>
                 <w:sz w:val="17"/>
               </w:rPr>
-              <w:t xml:space="preserve">Archivo a cargar (log608-1.txt / log608-2.txt): Registros cargados: 6818</w:t>
+              <w:t>Archivo a cargar (log607-1.txt / log607-2.txt): Registros cargados: 6818</w:t>
             </w:r>
             <w:r/>
           </w:p>
@@ -3813,7 +3813,7 @@
           <w:rFonts w:ascii="Courier New" w:hAnsi="Courier New"/>
           <w:sz w:val="19"/>
         </w:rPr>
-        <w:t xml:space="preserve">output608.out</w:t>
+        <w:t>output607.out</w:t>
       </w:r>
       <w:r>
         <w:t xml:space="preserve"> contra el resultado de un ordenamiento estable independiente (Python, </w:t>

</xml_diff>